<commit_message>
Day 8 Mastering Command line CLI
</commit_message>
<xml_diff>
--- a/0.1 Companies/ONe day.docx
+++ b/0.1 Companies/ONe day.docx
@@ -41,16 +41,7 @@
           <w:sz w:val="36"/>
           <w:szCs w:val="36"/>
         </w:rPr>
-        <w:t>Research Mapal (Aalen)</w:t>
-      </w:r>
-      <w:r>
-        <w:rPr>
-          <w:b/>
-          <w:bCs/>
-          <w:sz w:val="36"/>
-          <w:szCs w:val="36"/>
-        </w:rPr>
-        <w:t xml:space="preserve">: </w:t>
+        <w:t xml:space="preserve">Research Mapal (Aalen): </w:t>
       </w:r>
     </w:p>
     <w:p>
@@ -129,6 +120,9 @@
         </w:numPr>
       </w:pPr>
       <w:r>
+        <w:rPr>
+          <w:noProof/>
+        </w:rPr>
         <mc:AlternateContent>
           <mc:Choice Requires="wps">
             <w:drawing>
@@ -383,16 +377,7 @@
           <w:sz w:val="36"/>
           <w:szCs w:val="36"/>
         </w:rPr>
-        <w:t>/Stuttgart)</w:t>
-      </w:r>
-      <w:r>
-        <w:rPr>
-          <w:b/>
-          <w:bCs/>
-          <w:sz w:val="36"/>
-          <w:szCs w:val="36"/>
-        </w:rPr>
-        <w:t>:</w:t>
+        <w:t>/Stuttgart):</w:t>
       </w:r>
     </w:p>
     <w:p>
@@ -455,9 +440,6 @@
     <w:p>
       <w:pPr>
         <w:pStyle w:val="ListParagraph"/>
-        <w:rPr>
-          <w:lang w:val="en-US"/>
-        </w:rPr>
       </w:pPr>
       <w:hyperlink r:id="rId8" w:history="1">
         <w:r>
@@ -467,6 +449,212 @@
           <w:t>Vacancies | TRUMPF</w:t>
         </w:r>
       </w:hyperlink>
+    </w:p>
+    <w:p>
+      <w:pPr>
+        <w:pStyle w:val="ListParagraph"/>
+      </w:pPr>
+    </w:p>
+    <w:p>
+      <w:pPr>
+        <w:pStyle w:val="ListParagraph"/>
+      </w:pPr>
+    </w:p>
+    <w:p>
+      <w:pPr>
+        <w:pStyle w:val="ListParagraph"/>
+        <w:numPr>
+          <w:ilvl w:val="0"/>
+          <w:numId w:val="1"/>
+        </w:numPr>
+        <w:rPr>
+          <w:sz w:val="40"/>
+          <w:szCs w:val="40"/>
+        </w:rPr>
+      </w:pPr>
+      <w:r>
+        <w:rPr>
+          <w:b/>
+          <w:bCs/>
+          <w:sz w:val="40"/>
+          <w:szCs w:val="40"/>
+        </w:rPr>
+        <w:t xml:space="preserve">Companies such as Bosch, Zeiss </w:t>
+      </w:r>
+      <w:r>
+        <w:rPr>
+          <w:b/>
+          <w:bCs/>
+          <w:sz w:val="40"/>
+          <w:szCs w:val="40"/>
+        </w:rPr>
+        <w:br/>
+      </w:r>
+      <w:proofErr w:type="spellStart"/>
+      <w:r>
+        <w:rPr>
+          <w:b/>
+          <w:bCs/>
+          <w:sz w:val="22"/>
+          <w:szCs w:val="22"/>
+        </w:rPr>
+        <w:t>MLOps</w:t>
+      </w:r>
+      <w:proofErr w:type="spellEnd"/>
+      <w:r>
+        <w:rPr>
+          <w:b/>
+          <w:bCs/>
+          <w:sz w:val="22"/>
+          <w:szCs w:val="22"/>
+        </w:rPr>
+        <w:t>:</w:t>
+      </w:r>
+      <w:r>
+        <w:rPr>
+          <w:sz w:val="22"/>
+          <w:szCs w:val="22"/>
+        </w:rPr>
+        <w:t xml:space="preserve"> Their 2026 stack includes </w:t>
+      </w:r>
+      <w:r>
+        <w:rPr>
+          <w:b/>
+          <w:bCs/>
+          <w:sz w:val="22"/>
+          <w:szCs w:val="22"/>
+        </w:rPr>
+        <w:t>Terraform</w:t>
+      </w:r>
+      <w:r>
+        <w:rPr>
+          <w:sz w:val="22"/>
+          <w:szCs w:val="22"/>
+        </w:rPr>
+        <w:t xml:space="preserve">, </w:t>
+      </w:r>
+      <w:r>
+        <w:rPr>
+          <w:b/>
+          <w:bCs/>
+          <w:sz w:val="22"/>
+          <w:szCs w:val="22"/>
+        </w:rPr>
+        <w:t>Ansible</w:t>
+      </w:r>
+      <w:r>
+        <w:rPr>
+          <w:sz w:val="22"/>
+          <w:szCs w:val="22"/>
+        </w:rPr>
+        <w:t xml:space="preserve">, </w:t>
+      </w:r>
+      <w:r>
+        <w:rPr>
+          <w:b/>
+          <w:bCs/>
+          <w:sz w:val="22"/>
+          <w:szCs w:val="22"/>
+        </w:rPr>
+        <w:t>Docker</w:t>
+      </w:r>
+      <w:r>
+        <w:rPr>
+          <w:sz w:val="22"/>
+          <w:szCs w:val="22"/>
+        </w:rPr>
+        <w:t xml:space="preserve">, and </w:t>
+      </w:r>
+      <w:r>
+        <w:rPr>
+          <w:b/>
+          <w:bCs/>
+          <w:sz w:val="22"/>
+          <w:szCs w:val="22"/>
+        </w:rPr>
+        <w:t>Kubernetes</w:t>
+      </w:r>
+      <w:r>
+        <w:rPr>
+          <w:sz w:val="22"/>
+          <w:szCs w:val="22"/>
+        </w:rPr>
+        <w:t xml:space="preserve"> on Azure</w:t>
+      </w:r>
+      <w:r>
+        <w:rPr>
+          <w:sz w:val="40"/>
+          <w:szCs w:val="40"/>
+        </w:rPr>
+        <w:t>.</w:t>
+      </w:r>
+    </w:p>
+    <w:p>
+      <w:pPr>
+        <w:pStyle w:val="ListParagraph"/>
+        <w:numPr>
+          <w:ilvl w:val="0"/>
+          <w:numId w:val="1"/>
+        </w:numPr>
+        <w:rPr>
+          <w:b/>
+          <w:bCs/>
+          <w:sz w:val="36"/>
+          <w:szCs w:val="36"/>
+        </w:rPr>
+      </w:pPr>
+      <w:r>
+        <w:rPr>
+          <w:b/>
+          <w:bCs/>
+          <w:sz w:val="36"/>
+          <w:szCs w:val="36"/>
+        </w:rPr>
+        <w:t>ZEISS (</w:t>
+      </w:r>
+      <w:proofErr w:type="spellStart"/>
+      <w:r>
+        <w:rPr>
+          <w:b/>
+          <w:bCs/>
+          <w:sz w:val="36"/>
+          <w:szCs w:val="36"/>
+        </w:rPr>
+        <w:t>Oberkochen</w:t>
+      </w:r>
+      <w:proofErr w:type="spellEnd"/>
+      <w:r>
+        <w:rPr>
+          <w:b/>
+          <w:bCs/>
+          <w:sz w:val="36"/>
+          <w:szCs w:val="36"/>
+        </w:rPr>
+        <w:t>)</w:t>
+      </w:r>
+    </w:p>
+    <w:p>
+      <w:pPr>
+        <w:pStyle w:val="ListParagraph"/>
+        <w:rPr>
+          <w:b/>
+          <w:bCs/>
+          <w:sz w:val="36"/>
+          <w:szCs w:val="36"/>
+        </w:rPr>
+      </w:pPr>
+    </w:p>
+    <w:p>
+      <w:pPr>
+        <w:pStyle w:val="ListParagraph"/>
+      </w:pPr>
+    </w:p>
+    <w:p>
+      <w:pPr>
+        <w:rPr>
+          <w:lang w:val="en-US"/>
+        </w:rPr>
+      </w:pPr>
     </w:p>
     <w:sectPr>
       <w:type w:val="continuous"/>

</xml_diff>

<commit_message>
Normalize line endings to LF
</commit_message>
<xml_diff>
--- a/0.1 Companies/ONe day.docx
+++ b/0.1 Companies/ONe day.docx
@@ -636,6 +636,45 @@
     <w:p>
       <w:pPr>
         <w:pStyle w:val="ListParagraph"/>
+      </w:pPr>
+      <w:r>
+        <w:rPr>
+          <w:b/>
+          <w:bCs/>
+        </w:rPr>
+        <w:t>Airflow</w:t>
+      </w:r>
+      <w:r>
+        <w:t xml:space="preserve"> (orchestration) or </w:t>
+      </w:r>
+      <w:r>
+        <w:rPr>
+          <w:b/>
+          <w:bCs/>
+        </w:rPr>
+        <w:t>Kafka</w:t>
+      </w:r>
+      <w:r>
+        <w:t xml:space="preserve"> (real-time data streams).</w:t>
+      </w:r>
+    </w:p>
+    <w:p>
+      <w:pPr>
+        <w:pStyle w:val="ListParagraph"/>
+      </w:pPr>
+    </w:p>
+    <w:p>
+      <w:pPr>
+        <w:ind w:left="720"/>
+        <w:rPr>
+          <w:sz w:val="28"/>
+          <w:szCs w:val="28"/>
+        </w:rPr>
+      </w:pPr>
+    </w:p>
+    <w:p>
+      <w:pPr>
+        <w:pStyle w:val="ListParagraph"/>
         <w:rPr>
           <w:b/>
           <w:bCs/>
@@ -1017,6 +1056,95 @@
       </w:rPr>
     </w:lvl>
   </w:abstractNum>
+  <w:abstractNum w:abstractNumId="3" w15:restartNumberingAfterBreak="0">
+    <w:nsid w:val="605B4EC9"/>
+    <w:multiLevelType w:val="hybridMultilevel"/>
+    <w:tmpl w:val="890E4D2A"/>
+    <w:lvl w:ilvl="0" w:tplc="4009000F">
+      <w:start w:val="1"/>
+      <w:numFmt w:val="decimal"/>
+      <w:lvlText w:val="%1."/>
+      <w:lvlJc w:val="left"/>
+      <w:pPr>
+        <w:ind w:left="720" w:hanging="360"/>
+      </w:pPr>
+      <w:rPr>
+        <w:rFonts w:hint="default"/>
+      </w:rPr>
+    </w:lvl>
+    <w:lvl w:ilvl="1" w:tplc="40090019" w:tentative="1">
+      <w:start w:val="1"/>
+      <w:numFmt w:val="lowerLetter"/>
+      <w:lvlText w:val="%2."/>
+      <w:lvlJc w:val="left"/>
+      <w:pPr>
+        <w:ind w:left="1440" w:hanging="360"/>
+      </w:pPr>
+    </w:lvl>
+    <w:lvl w:ilvl="2" w:tplc="4009001B" w:tentative="1">
+      <w:start w:val="1"/>
+      <w:numFmt w:val="lowerRoman"/>
+      <w:lvlText w:val="%3."/>
+      <w:lvlJc w:val="right"/>
+      <w:pPr>
+        <w:ind w:left="2160" w:hanging="180"/>
+      </w:pPr>
+    </w:lvl>
+    <w:lvl w:ilvl="3" w:tplc="4009000F" w:tentative="1">
+      <w:start w:val="1"/>
+      <w:numFmt w:val="decimal"/>
+      <w:lvlText w:val="%4."/>
+      <w:lvlJc w:val="left"/>
+      <w:pPr>
+        <w:ind w:left="2880" w:hanging="360"/>
+      </w:pPr>
+    </w:lvl>
+    <w:lvl w:ilvl="4" w:tplc="40090019" w:tentative="1">
+      <w:start w:val="1"/>
+      <w:numFmt w:val="lowerLetter"/>
+      <w:lvlText w:val="%5."/>
+      <w:lvlJc w:val="left"/>
+      <w:pPr>
+        <w:ind w:left="3600" w:hanging="360"/>
+      </w:pPr>
+    </w:lvl>
+    <w:lvl w:ilvl="5" w:tplc="4009001B" w:tentative="1">
+      <w:start w:val="1"/>
+      <w:numFmt w:val="lowerRoman"/>
+      <w:lvlText w:val="%6."/>
+      <w:lvlJc w:val="right"/>
+      <w:pPr>
+        <w:ind w:left="4320" w:hanging="180"/>
+      </w:pPr>
+    </w:lvl>
+    <w:lvl w:ilvl="6" w:tplc="4009000F" w:tentative="1">
+      <w:start w:val="1"/>
+      <w:numFmt w:val="decimal"/>
+      <w:lvlText w:val="%7."/>
+      <w:lvlJc w:val="left"/>
+      <w:pPr>
+        <w:ind w:left="5040" w:hanging="360"/>
+      </w:pPr>
+    </w:lvl>
+    <w:lvl w:ilvl="7" w:tplc="40090019" w:tentative="1">
+      <w:start w:val="1"/>
+      <w:numFmt w:val="lowerLetter"/>
+      <w:lvlText w:val="%8."/>
+      <w:lvlJc w:val="left"/>
+      <w:pPr>
+        <w:ind w:left="5760" w:hanging="360"/>
+      </w:pPr>
+    </w:lvl>
+    <w:lvl w:ilvl="8" w:tplc="4009001B" w:tentative="1">
+      <w:start w:val="1"/>
+      <w:numFmt w:val="lowerRoman"/>
+      <w:lvlText w:val="%9."/>
+      <w:lvlJc w:val="right"/>
+      <w:pPr>
+        <w:ind w:left="6480" w:hanging="180"/>
+      </w:pPr>
+    </w:lvl>
+  </w:abstractNum>
   <w:num w:numId="1" w16cid:durableId="1067530020">
     <w:abstractNumId w:val="0"/>
   </w:num>
@@ -1025,6 +1153,9 @@
   </w:num>
   <w:num w:numId="3" w16cid:durableId="889346486">
     <w:abstractNumId w:val="2"/>
+  </w:num>
+  <w:num w:numId="4" w16cid:durableId="433670817">
+    <w:abstractNumId w:val="3"/>
   </w:num>
 </w:numbering>
 </file>
@@ -1632,6 +1763,7 @@
   <w:style w:type="character" w:default="1" w:styleId="DefaultParagraphFont">
     <w:name w:val="Default Paragraph Font"/>
     <w:uiPriority w:val="1"/>
+    <w:semiHidden/>
     <w:unhideWhenUsed/>
   </w:style>
   <w:style w:type="table" w:default="1" w:styleId="TableNormal">

</xml_diff>

<commit_message>
Day 13 ABC and Interface Design
</commit_message>
<xml_diff>
--- a/0.1 Companies/ONe day.docx
+++ b/0.1 Companies/ONe day.docx
@@ -656,6 +656,21 @@
       </w:r>
       <w:r>
         <w:t xml:space="preserve"> (real-time data streams).</w:t>
+      </w:r>
+    </w:p>
+    <w:p>
+      <w:pPr>
+        <w:pStyle w:val="ListParagraph"/>
+      </w:pPr>
+      <w:r>
+        <w:rPr>
+          <w:b/>
+          <w:bCs/>
+        </w:rPr>
+        <w:t>ZEISS</w:t>
+      </w:r>
+      <w:r>
+        <w:t xml:space="preserve"> specifically looks for advocates of "modular architecture" and "documentation".</w:t>
       </w:r>
     </w:p>
     <w:p>
@@ -1763,7 +1778,6 @@
   <w:style w:type="character" w:default="1" w:styleId="DefaultParagraphFont">
     <w:name w:val="Default Paragraph Font"/>
     <w:uiPriority w:val="1"/>
-    <w:semiHidden/>
     <w:unhideWhenUsed/>
   </w:style>
   <w:style w:type="table" w:default="1" w:styleId="TableNormal">

</xml_diff>

<commit_message>
await and async with fast api
</commit_message>
<xml_diff>
--- a/0.1 Companies/ONe day.docx
+++ b/0.1 Companies/ONe day.docx
@@ -5,15 +5,15 @@
     <w:p>
       <w:pPr>
         <w:rPr>
-          <w:sz w:val="32"/>
-          <w:szCs w:val="32"/>
+          <w:sz w:val="28"/>
+          <w:szCs w:val="28"/>
           <w:lang w:val="en-US"/>
         </w:rPr>
       </w:pPr>
       <w:r>
         <w:rPr>
-          <w:sz w:val="32"/>
-          <w:szCs w:val="32"/>
+          <w:sz w:val="28"/>
+          <w:szCs w:val="28"/>
           <w:lang w:val="en-US"/>
         </w:rPr>
         <w:t>Companies:</w:t>
@@ -29,8 +29,8 @@
         <w:rPr>
           <w:b/>
           <w:bCs/>
-          <w:sz w:val="36"/>
-          <w:szCs w:val="36"/>
+          <w:sz w:val="32"/>
+          <w:szCs w:val="32"/>
           <w:lang w:val="en-US"/>
         </w:rPr>
       </w:pPr>
@@ -38,8 +38,8 @@
         <w:rPr>
           <w:b/>
           <w:bCs/>
-          <w:sz w:val="36"/>
-          <w:szCs w:val="36"/>
+          <w:sz w:val="32"/>
+          <w:szCs w:val="32"/>
         </w:rPr>
         <w:t xml:space="preserve">Research Mapal (Aalen): </w:t>
       </w:r>
@@ -47,8 +47,16 @@
     <w:p>
       <w:pPr>
         <w:pStyle w:val="ListParagraph"/>
-      </w:pPr>
-      <w:r>
+        <w:rPr>
+          <w:sz w:val="28"/>
+          <w:szCs w:val="28"/>
+        </w:rPr>
+      </w:pPr>
+      <w:r>
+        <w:rPr>
+          <w:sz w:val="28"/>
+          <w:szCs w:val="28"/>
+        </w:rPr>
         <w:t>They are a world leader in precision tools and are increasingly using AI for predictive maintenance and smart manufacturing</w:t>
       </w:r>
     </w:p>
@@ -62,6 +70,8 @@
         <w:rPr>
           <w:b/>
           <w:bCs/>
+          <w:sz w:val="28"/>
+          <w:szCs w:val="28"/>
         </w:rPr>
         <w:sectPr>
           <w:pgSz w:w="11906" w:h="16838"/>
@@ -81,12 +91,16 @@
         <w:rPr>
           <w:b/>
           <w:bCs/>
+          <w:sz w:val="28"/>
+          <w:szCs w:val="28"/>
         </w:rPr>
       </w:pPr>
       <w:r>
         <w:rPr>
           <w:b/>
           <w:bCs/>
+          <w:sz w:val="28"/>
+          <w:szCs w:val="28"/>
         </w:rPr>
         <w:t>Henrik Konrad</w:t>
       </w:r>
@@ -98,15 +112,31 @@
           <w:ilvl w:val="1"/>
           <w:numId w:val="2"/>
         </w:numPr>
-      </w:pPr>
-      <w:r>
+        <w:rPr>
+          <w:sz w:val="28"/>
+          <w:szCs w:val="28"/>
+        </w:rPr>
+      </w:pPr>
+      <w:r>
+        <w:rPr>
+          <w:sz w:val="28"/>
+          <w:szCs w:val="28"/>
+        </w:rPr>
         <w:t>Your contact for technical apprenticeships, students</w:t>
       </w:r>
       <w:r>
+        <w:rPr>
+          <w:sz w:val="28"/>
+          <w:szCs w:val="28"/>
+        </w:rPr>
         <w:br/>
         <w:t>Phone.:  +49 7361 585-3354</w:t>
       </w:r>
       <w:r>
+        <w:rPr>
+          <w:sz w:val="28"/>
+          <w:szCs w:val="28"/>
+        </w:rPr>
         <w:br/>
         <w:t>henrik.konrad@mapal.com</w:t>
       </w:r>
@@ -118,10 +148,16 @@
           <w:ilvl w:val="0"/>
           <w:numId w:val="2"/>
         </w:numPr>
+        <w:rPr>
+          <w:sz w:val="28"/>
+          <w:szCs w:val="28"/>
+        </w:rPr>
       </w:pPr>
       <w:r>
         <w:rPr>
           <w:noProof/>
+          <w:sz w:val="28"/>
+          <w:szCs w:val="28"/>
         </w:rPr>
         <mc:AlternateContent>
           <mc:Choice Requires="wps">
@@ -194,6 +230,8 @@
         <w:rPr>
           <w:b/>
           <w:bCs/>
+          <w:sz w:val="28"/>
+          <w:szCs w:val="28"/>
         </w:rPr>
         <w:t>Michael Barth</w:t>
       </w:r>
@@ -205,15 +243,31 @@
           <w:ilvl w:val="1"/>
           <w:numId w:val="2"/>
         </w:numPr>
-      </w:pPr>
-      <w:r>
+        <w:rPr>
+          <w:sz w:val="28"/>
+          <w:szCs w:val="28"/>
+        </w:rPr>
+      </w:pPr>
+      <w:r>
+        <w:rPr>
+          <w:sz w:val="28"/>
+          <w:szCs w:val="28"/>
+        </w:rPr>
         <w:t>Your contact for IT apprenticeships </w:t>
       </w:r>
       <w:r>
+        <w:rPr>
+          <w:sz w:val="28"/>
+          <w:szCs w:val="28"/>
+        </w:rPr>
         <w:br/>
         <w:t>Phone: +49 7361 585-1464</w:t>
       </w:r>
       <w:r>
+        <w:rPr>
+          <w:sz w:val="28"/>
+          <w:szCs w:val="28"/>
+        </w:rPr>
         <w:br/>
         <w:t>​​​​​​​E-Mail: michael.barth@mapal.com</w:t>
       </w:r>
@@ -221,6 +275,10 @@
     <w:p>
       <w:pPr>
         <w:ind w:left="360"/>
+        <w:rPr>
+          <w:sz w:val="28"/>
+          <w:szCs w:val="28"/>
+        </w:rPr>
       </w:pPr>
     </w:p>
     <w:p>
@@ -233,12 +291,16 @@
         <w:rPr>
           <w:b/>
           <w:bCs/>
+          <w:sz w:val="28"/>
+          <w:szCs w:val="28"/>
         </w:rPr>
       </w:pPr>
       <w:r>
         <w:rPr>
           <w:b/>
           <w:bCs/>
+          <w:sz w:val="28"/>
+          <w:szCs w:val="28"/>
         </w:rPr>
         <w:t>Gerd Dambacher</w:t>
       </w:r>
@@ -250,23 +312,33 @@
           <w:ilvl w:val="1"/>
           <w:numId w:val="2"/>
         </w:numPr>
-      </w:pPr>
-      <w:r>
+        <w:rPr>
+          <w:sz w:val="28"/>
+          <w:szCs w:val="28"/>
+        </w:rPr>
+      </w:pPr>
+      <w:r>
+        <w:rPr>
+          <w:sz w:val="28"/>
+          <w:szCs w:val="28"/>
+        </w:rPr>
         <w:t>Your contact for technical internships</w:t>
       </w:r>
       <w:r>
+        <w:rPr>
+          <w:sz w:val="28"/>
+          <w:szCs w:val="28"/>
+        </w:rPr>
         <w:br/>
         <w:t>Phone: +49 7361 585-1411</w:t>
       </w:r>
       <w:r>
+        <w:rPr>
+          <w:sz w:val="28"/>
+          <w:szCs w:val="28"/>
+        </w:rPr>
         <w:br/>
-        <w:t>​​​​​​​E-Mail: gerd.dambacher@mapal.c</w:t>
-      </w:r>
-      <w:r>
-        <w:t>o</w:t>
-      </w:r>
-      <w:r>
-        <w:t>m</w:t>
+        <w:t>​​​​​​​E-Mail: gerd.dambacher@mapal.com</w:t>
       </w:r>
     </w:p>
     <w:p>
@@ -276,11 +348,17 @@
           <w:ilvl w:val="0"/>
           <w:numId w:val="2"/>
         </w:numPr>
+        <w:rPr>
+          <w:sz w:val="28"/>
+          <w:szCs w:val="28"/>
+        </w:rPr>
       </w:pPr>
       <w:r>
         <w:rPr>
           <w:b/>
           <w:bCs/>
+          <w:sz w:val="28"/>
+          <w:szCs w:val="28"/>
         </w:rPr>
         <w:t>Laura Kuhar</w:t>
       </w:r>
@@ -292,15 +370,31 @@
           <w:ilvl w:val="1"/>
           <w:numId w:val="2"/>
         </w:numPr>
-      </w:pPr>
-      <w:r>
+        <w:rPr>
+          <w:sz w:val="28"/>
+          <w:szCs w:val="28"/>
+        </w:rPr>
+      </w:pPr>
+      <w:r>
+        <w:rPr>
+          <w:sz w:val="28"/>
+          <w:szCs w:val="28"/>
+        </w:rPr>
         <w:t>Your contact for work placements, holiday jobs, substitutes</w:t>
       </w:r>
       <w:r>
+        <w:rPr>
+          <w:sz w:val="28"/>
+          <w:szCs w:val="28"/>
+        </w:rPr>
         <w:br/>
         <w:t>Phone: +49 7361 585-3684</w:t>
       </w:r>
       <w:r>
+        <w:rPr>
+          <w:sz w:val="28"/>
+          <w:szCs w:val="28"/>
+        </w:rPr>
         <w:br/>
         <w:t>​​​​​​​E-Mail: laura.kuhar@mapal.com</w:t>
       </w:r>
@@ -308,6 +402,10 @@
     <w:p>
       <w:pPr>
         <w:pStyle w:val="ListParagraph"/>
+        <w:rPr>
+          <w:sz w:val="28"/>
+          <w:szCs w:val="28"/>
+        </w:rPr>
         <w:sectPr>
           <w:type w:val="continuous"/>
           <w:pgSz w:w="11906" w:h="16838"/>
@@ -320,11 +418,17 @@
     <w:p>
       <w:pPr>
         <w:pStyle w:val="ListParagraph"/>
+        <w:rPr>
+          <w:sz w:val="28"/>
+          <w:szCs w:val="28"/>
+        </w:rPr>
       </w:pPr>
       <w:hyperlink r:id="rId5" w:history="1">
         <w:r>
           <w:rPr>
             <w:rStyle w:val="Hyperlink"/>
+            <w:sz w:val="28"/>
+            <w:szCs w:val="28"/>
           </w:rPr>
           <w:t>Jobs | MAPAL</w:t>
         </w:r>
@@ -333,6 +437,10 @@
     <w:p>
       <w:pPr>
         <w:pStyle w:val="ListParagraph"/>
+        <w:rPr>
+          <w:sz w:val="28"/>
+          <w:szCs w:val="28"/>
+        </w:rPr>
       </w:pPr>
     </w:p>
     <w:p>
@@ -345,8 +453,8 @@
         <w:rPr>
           <w:b/>
           <w:bCs/>
-          <w:sz w:val="36"/>
-          <w:szCs w:val="36"/>
+          <w:sz w:val="32"/>
+          <w:szCs w:val="32"/>
           <w:lang w:val="en-US"/>
         </w:rPr>
       </w:pPr>
@@ -354,8 +462,8 @@
         <w:rPr>
           <w:b/>
           <w:bCs/>
-          <w:sz w:val="36"/>
-          <w:szCs w:val="36"/>
+          <w:sz w:val="32"/>
+          <w:szCs w:val="32"/>
         </w:rPr>
         <w:t>Research TRUMPF (</w:t>
       </w:r>
@@ -364,8 +472,8 @@
         <w:rPr>
           <w:b/>
           <w:bCs/>
-          <w:sz w:val="36"/>
-          <w:szCs w:val="36"/>
+          <w:sz w:val="32"/>
+          <w:szCs w:val="32"/>
         </w:rPr>
         <w:t>Ditzingen</w:t>
       </w:r>
@@ -374,8 +482,8 @@
         <w:rPr>
           <w:b/>
           <w:bCs/>
-          <w:sz w:val="36"/>
-          <w:szCs w:val="36"/>
+          <w:sz w:val="32"/>
+          <w:szCs w:val="32"/>
         </w:rPr>
         <w:t>/Stuttgart):</w:t>
       </w:r>
@@ -383,25 +491,41 @@
     <w:p>
       <w:pPr>
         <w:pStyle w:val="ListParagraph"/>
-      </w:pPr>
-      <w:r>
+        <w:rPr>
+          <w:sz w:val="28"/>
+          <w:szCs w:val="28"/>
+        </w:rPr>
+      </w:pPr>
+      <w:r>
+        <w:rPr>
+          <w:sz w:val="28"/>
+          <w:szCs w:val="28"/>
+        </w:rPr>
         <w:t>A massive high-tech company specializing in machine tools and lasers.</w:t>
       </w:r>
     </w:p>
     <w:p>
       <w:pPr>
         <w:pStyle w:val="ListParagraph"/>
-      </w:pPr>
-    </w:p>
-    <w:p>
-      <w:pPr>
-        <w:pStyle w:val="ListParagraph"/>
-        <w:rPr>
+        <w:rPr>
+          <w:sz w:val="28"/>
+          <w:szCs w:val="28"/>
+        </w:rPr>
+      </w:pPr>
+    </w:p>
+    <w:p>
+      <w:pPr>
+        <w:pStyle w:val="ListParagraph"/>
+        <w:rPr>
+          <w:sz w:val="28"/>
+          <w:szCs w:val="28"/>
           <w:lang w:val="en-US"/>
         </w:rPr>
       </w:pPr>
       <w:r>
         <w:rPr>
+          <w:sz w:val="28"/>
+          <w:szCs w:val="28"/>
           <w:lang w:val="en-US"/>
         </w:rPr>
         <w:t xml:space="preserve">"info@de.trumpf.com" </w:t>
@@ -410,6 +534,8 @@
         <w:r>
           <w:rPr>
             <w:rStyle w:val="Hyperlink"/>
+            <w:sz w:val="28"/>
+            <w:szCs w:val="28"/>
             <w:lang w:val="en-US"/>
           </w:rPr>
           <w:t>info@de.trumpf.com</w:t>
@@ -419,12 +545,18 @@
     <w:p>
       <w:pPr>
         <w:pStyle w:val="ListParagraph"/>
+        <w:rPr>
+          <w:sz w:val="28"/>
+          <w:szCs w:val="28"/>
+        </w:rPr>
       </w:pPr>
       <w:hyperlink r:id="rId7" w:history="1">
         <w:proofErr w:type="spellStart"/>
         <w:r>
           <w:rPr>
             <w:rStyle w:val="Hyperlink"/>
+            <w:sz w:val="28"/>
+            <w:szCs w:val="28"/>
           </w:rPr>
           <w:t>Telefon</w:t>
         </w:r>
@@ -432,6 +564,8 @@
         <w:r>
           <w:rPr>
             <w:rStyle w:val="Hyperlink"/>
+            <w:sz w:val="28"/>
+            <w:szCs w:val="28"/>
           </w:rPr>
           <w:t xml:space="preserve"> +49 7156 3030</w:t>
         </w:r>
@@ -440,11 +574,17 @@
     <w:p>
       <w:pPr>
         <w:pStyle w:val="ListParagraph"/>
+        <w:rPr>
+          <w:sz w:val="28"/>
+          <w:szCs w:val="28"/>
+        </w:rPr>
       </w:pPr>
       <w:hyperlink r:id="rId8" w:history="1">
         <w:r>
           <w:rPr>
             <w:rStyle w:val="Hyperlink"/>
+            <w:sz w:val="28"/>
+            <w:szCs w:val="28"/>
           </w:rPr>
           <w:t>Vacancies | TRUMPF</w:t>
         </w:r>
@@ -453,11 +593,19 @@
     <w:p>
       <w:pPr>
         <w:pStyle w:val="ListParagraph"/>
-      </w:pPr>
-    </w:p>
-    <w:p>
-      <w:pPr>
-        <w:pStyle w:val="ListParagraph"/>
+        <w:rPr>
+          <w:sz w:val="28"/>
+          <w:szCs w:val="28"/>
+        </w:rPr>
+      </w:pPr>
+    </w:p>
+    <w:p>
+      <w:pPr>
+        <w:pStyle w:val="ListParagraph"/>
+        <w:rPr>
+          <w:sz w:val="28"/>
+          <w:szCs w:val="28"/>
+        </w:rPr>
       </w:pPr>
     </w:p>
     <w:p>
@@ -468,16 +616,16 @@
           <w:numId w:val="1"/>
         </w:numPr>
         <w:rPr>
-          <w:sz w:val="40"/>
-          <w:szCs w:val="40"/>
+          <w:sz w:val="28"/>
+          <w:szCs w:val="28"/>
         </w:rPr>
       </w:pPr>
       <w:r>
         <w:rPr>
           <w:b/>
           <w:bCs/>
-          <w:sz w:val="40"/>
-          <w:szCs w:val="40"/>
+          <w:sz w:val="32"/>
+          <w:szCs w:val="32"/>
         </w:rPr>
         <w:t xml:space="preserve">Companies such as Bosch, Zeiss </w:t>
       </w:r>
@@ -485,8 +633,8 @@
         <w:rPr>
           <w:b/>
           <w:bCs/>
-          <w:sz w:val="40"/>
-          <w:szCs w:val="40"/>
+          <w:sz w:val="28"/>
+          <w:szCs w:val="28"/>
         </w:rPr>
         <w:br/>
       </w:r>
@@ -495,8 +643,8 @@
         <w:rPr>
           <w:b/>
           <w:bCs/>
-          <w:sz w:val="22"/>
-          <w:szCs w:val="22"/>
+          <w:sz w:val="28"/>
+          <w:szCs w:val="28"/>
         </w:rPr>
         <w:t>MLOps</w:t>
       </w:r>
@@ -505,15 +653,15 @@
         <w:rPr>
           <w:b/>
           <w:bCs/>
-          <w:sz w:val="22"/>
-          <w:szCs w:val="22"/>
+          <w:sz w:val="28"/>
+          <w:szCs w:val="28"/>
         </w:rPr>
         <w:t>:</w:t>
       </w:r>
       <w:r>
         <w:rPr>
-          <w:sz w:val="22"/>
-          <w:szCs w:val="22"/>
+          <w:sz w:val="28"/>
+          <w:szCs w:val="28"/>
         </w:rPr>
         <w:t xml:space="preserve"> Their 2026 stack includes </w:t>
       </w:r>
@@ -521,15 +669,15 @@
         <w:rPr>
           <w:b/>
           <w:bCs/>
-          <w:sz w:val="22"/>
-          <w:szCs w:val="22"/>
+          <w:sz w:val="28"/>
+          <w:szCs w:val="28"/>
         </w:rPr>
         <w:t>Terraform</w:t>
       </w:r>
       <w:r>
         <w:rPr>
-          <w:sz w:val="22"/>
-          <w:szCs w:val="22"/>
+          <w:sz w:val="28"/>
+          <w:szCs w:val="28"/>
         </w:rPr>
         <w:t xml:space="preserve">, </w:t>
       </w:r>
@@ -537,15 +685,15 @@
         <w:rPr>
           <w:b/>
           <w:bCs/>
-          <w:sz w:val="22"/>
-          <w:szCs w:val="22"/>
+          <w:sz w:val="28"/>
+          <w:szCs w:val="28"/>
         </w:rPr>
         <w:t>Ansible</w:t>
       </w:r>
       <w:r>
         <w:rPr>
-          <w:sz w:val="22"/>
-          <w:szCs w:val="22"/>
+          <w:sz w:val="28"/>
+          <w:szCs w:val="28"/>
         </w:rPr>
         <w:t xml:space="preserve">, </w:t>
       </w:r>
@@ -553,15 +701,15 @@
         <w:rPr>
           <w:b/>
           <w:bCs/>
-          <w:sz w:val="22"/>
-          <w:szCs w:val="22"/>
+          <w:sz w:val="28"/>
+          <w:szCs w:val="28"/>
         </w:rPr>
         <w:t>Docker</w:t>
       </w:r>
       <w:r>
         <w:rPr>
-          <w:sz w:val="22"/>
-          <w:szCs w:val="22"/>
+          <w:sz w:val="28"/>
+          <w:szCs w:val="28"/>
         </w:rPr>
         <w:t xml:space="preserve">, and </w:t>
       </w:r>
@@ -569,24 +717,17 @@
         <w:rPr>
           <w:b/>
           <w:bCs/>
-          <w:sz w:val="22"/>
-          <w:szCs w:val="22"/>
+          <w:sz w:val="28"/>
+          <w:szCs w:val="28"/>
         </w:rPr>
         <w:t>Kubernetes</w:t>
       </w:r>
       <w:r>
         <w:rPr>
-          <w:sz w:val="22"/>
-          <w:szCs w:val="22"/>
-        </w:rPr>
-        <w:t xml:space="preserve"> on Azure</w:t>
-      </w:r>
-      <w:r>
-        <w:rPr>
-          <w:sz w:val="40"/>
-          <w:szCs w:val="40"/>
-        </w:rPr>
-        <w:t>.</w:t>
+          <w:sz w:val="28"/>
+          <w:szCs w:val="28"/>
+        </w:rPr>
+        <w:t xml:space="preserve"> on Azure.</w:t>
       </w:r>
     </w:p>
     <w:p>
@@ -597,115 +738,205 @@
           <w:numId w:val="1"/>
         </w:numPr>
         <w:rPr>
+          <w:sz w:val="32"/>
+          <w:szCs w:val="32"/>
+        </w:rPr>
+      </w:pPr>
+      <w:r>
+        <w:rPr>
           <w:b/>
           <w:bCs/>
-          <w:sz w:val="36"/>
-          <w:szCs w:val="36"/>
-        </w:rPr>
-      </w:pPr>
+          <w:sz w:val="32"/>
+          <w:szCs w:val="32"/>
+        </w:rPr>
+        <w:t>ZEISS (</w:t>
+      </w:r>
+      <w:proofErr w:type="spellStart"/>
       <w:r>
         <w:rPr>
           <w:b/>
           <w:bCs/>
-          <w:sz w:val="36"/>
-          <w:szCs w:val="36"/>
-        </w:rPr>
-        <w:t>ZEISS (</w:t>
-      </w:r>
-      <w:proofErr w:type="spellStart"/>
+          <w:sz w:val="32"/>
+          <w:szCs w:val="32"/>
+        </w:rPr>
+        <w:t>Oberkochen</w:t>
+      </w:r>
+      <w:proofErr w:type="spellEnd"/>
       <w:r>
         <w:rPr>
           <w:b/>
           <w:bCs/>
-          <w:sz w:val="36"/>
-          <w:szCs w:val="36"/>
-        </w:rPr>
-        <w:t>Oberkochen</w:t>
-      </w:r>
-      <w:proofErr w:type="spellEnd"/>
+          <w:sz w:val="32"/>
+          <w:szCs w:val="32"/>
+        </w:rPr>
+        <w:t>)</w:t>
+      </w:r>
+    </w:p>
+    <w:p>
+      <w:pPr>
+        <w:pStyle w:val="ListParagraph"/>
+        <w:rPr>
+          <w:sz w:val="28"/>
+          <w:szCs w:val="28"/>
+        </w:rPr>
+      </w:pPr>
       <w:r>
         <w:rPr>
           <w:b/>
           <w:bCs/>
-          <w:sz w:val="36"/>
-          <w:szCs w:val="36"/>
-        </w:rPr>
-        <w:t>)</w:t>
-      </w:r>
-    </w:p>
-    <w:p>
-      <w:pPr>
-        <w:pStyle w:val="ListParagraph"/>
-      </w:pPr>
+          <w:sz w:val="28"/>
+          <w:szCs w:val="28"/>
+        </w:rPr>
+        <w:t>Airflow</w:t>
+      </w:r>
+      <w:r>
+        <w:rPr>
+          <w:sz w:val="28"/>
+          <w:szCs w:val="28"/>
+        </w:rPr>
+        <w:t xml:space="preserve"> (orchestration) or </w:t>
+      </w:r>
       <w:r>
         <w:rPr>
           <w:b/>
           <w:bCs/>
-        </w:rPr>
-        <w:t>Airflow</w:t>
-      </w:r>
-      <w:r>
-        <w:t xml:space="preserve"> (orchestration) or </w:t>
-      </w:r>
+          <w:sz w:val="28"/>
+          <w:szCs w:val="28"/>
+        </w:rPr>
+        <w:t>Kafka</w:t>
+      </w:r>
+      <w:r>
+        <w:rPr>
+          <w:sz w:val="28"/>
+          <w:szCs w:val="28"/>
+        </w:rPr>
+        <w:t xml:space="preserve"> (real-time data streams).</w:t>
+      </w:r>
+    </w:p>
+    <w:p>
+      <w:pPr>
+        <w:pStyle w:val="ListParagraph"/>
+        <w:rPr>
+          <w:sz w:val="28"/>
+          <w:szCs w:val="28"/>
+        </w:rPr>
+      </w:pPr>
       <w:r>
         <w:rPr>
           <w:b/>
           <w:bCs/>
-        </w:rPr>
-        <w:t>Kafka</w:t>
-      </w:r>
-      <w:r>
-        <w:t xml:space="preserve"> (real-time data streams).</w:t>
-      </w:r>
-    </w:p>
-    <w:p>
-      <w:pPr>
-        <w:pStyle w:val="ListParagraph"/>
-      </w:pPr>
-      <w:r>
+          <w:sz w:val="28"/>
+          <w:szCs w:val="28"/>
+        </w:rPr>
+        <w:t>ZEISS</w:t>
+      </w:r>
+      <w:r>
+        <w:rPr>
+          <w:sz w:val="28"/>
+          <w:szCs w:val="28"/>
+        </w:rPr>
+        <w:t xml:space="preserve"> specifically looks for advocates of "modular architecture" and "documentation".</w:t>
+      </w:r>
+    </w:p>
+    <w:p>
+      <w:pPr>
+        <w:pStyle w:val="ListParagraph"/>
+        <w:rPr>
+          <w:rStyle w:val="Strong"/>
+          <w:sz w:val="28"/>
+          <w:szCs w:val="28"/>
+        </w:rPr>
+      </w:pPr>
+    </w:p>
+    <w:p>
+      <w:pPr>
+        <w:pStyle w:val="ListParagraph"/>
+        <w:numPr>
+          <w:ilvl w:val="0"/>
+          <w:numId w:val="1"/>
+        </w:numPr>
+        <w:rPr>
+          <w:sz w:val="28"/>
+          <w:szCs w:val="28"/>
+        </w:rPr>
+      </w:pPr>
+      <w:r>
+        <w:rPr>
+          <w:rStyle w:val="Strong"/>
+          <w:sz w:val="32"/>
+          <w:szCs w:val="32"/>
+        </w:rPr>
+        <w:t>Voith – Heidenheim, Germany</w:t>
+      </w:r>
+      <w:r>
+        <w:rPr>
+          <w:sz w:val="28"/>
+          <w:szCs w:val="28"/>
+        </w:rPr>
+        <w:br/>
+        <w:t xml:space="preserve">Voith is a German industrial technology company headquartered in Heidenheim. The company works in areas such as automation, smart manufacturing, digital solutions, </w:t>
+      </w:r>
+      <w:r>
+        <w:rPr>
+          <w:sz w:val="28"/>
+          <w:szCs w:val="28"/>
+        </w:rPr>
+        <w:lastRenderedPageBreak/>
+        <w:t>hydro systems, paper technologies, and industrial engineering. For AI/ML roles, Voith is relevant in predictive maintenance, Industrial IoT, sensor data analysis, reliability engineering, and data-driven manufacturing systems. Strong focus areas include Industry 4.0, digital transformation, and production-grade industrial systems.</w:t>
+      </w:r>
+    </w:p>
+    <w:p>
+      <w:pPr>
+        <w:pStyle w:val="ListParagraph"/>
+        <w:rPr>
+          <w:sz w:val="28"/>
+          <w:szCs w:val="28"/>
+        </w:rPr>
+      </w:pPr>
+    </w:p>
+    <w:p>
+      <w:pPr>
+        <w:pStyle w:val="ListParagraph"/>
+        <w:rPr>
+          <w:sz w:val="28"/>
+          <w:szCs w:val="28"/>
+        </w:rPr>
+      </w:pPr>
+    </w:p>
+    <w:p>
+      <w:pPr>
+        <w:ind w:left="720"/>
+        <w:rPr>
+          <w:sz w:val="28"/>
+          <w:szCs w:val="28"/>
+        </w:rPr>
+      </w:pPr>
+    </w:p>
+    <w:p>
+      <w:pPr>
+        <w:pStyle w:val="ListParagraph"/>
         <w:rPr>
           <w:b/>
           <w:bCs/>
-        </w:rPr>
-        <w:t>ZEISS</w:t>
-      </w:r>
-      <w:r>
-        <w:t xml:space="preserve"> specifically looks for advocates of "modular architecture" and "documentation".</w:t>
-      </w:r>
-    </w:p>
-    <w:p>
-      <w:pPr>
-        <w:pStyle w:val="ListParagraph"/>
-      </w:pPr>
-    </w:p>
-    <w:p>
-      <w:pPr>
-        <w:ind w:left="720"/>
-        <w:rPr>
-          <w:sz w:val="28"/>
-          <w:szCs w:val="28"/>
-        </w:rPr>
-      </w:pPr>
-    </w:p>
-    <w:p>
-      <w:pPr>
-        <w:pStyle w:val="ListParagraph"/>
-        <w:rPr>
-          <w:b/>
-          <w:bCs/>
-          <w:sz w:val="36"/>
-          <w:szCs w:val="36"/>
-        </w:rPr>
-      </w:pPr>
-    </w:p>
-    <w:p>
-      <w:pPr>
-        <w:pStyle w:val="ListParagraph"/>
-      </w:pPr>
-    </w:p>
-    <w:p>
-      <w:pPr>
-        <w:rPr>
+          <w:sz w:val="28"/>
+          <w:szCs w:val="28"/>
+        </w:rPr>
+      </w:pPr>
+    </w:p>
+    <w:p>
+      <w:pPr>
+        <w:pStyle w:val="ListParagraph"/>
+        <w:rPr>
+          <w:sz w:val="28"/>
+          <w:szCs w:val="28"/>
+        </w:rPr>
+      </w:pPr>
+    </w:p>
+    <w:p>
+      <w:pPr>
+        <w:rPr>
+          <w:sz w:val="28"/>
+          <w:szCs w:val="28"/>
           <w:lang w:val="en-US"/>
         </w:rPr>
       </w:pPr>
@@ -724,6 +955,178 @@
 <file path=word/numbering.xml><?xml version="1.0" encoding="utf-8"?>
 <w:numbering xmlns:wpc="http://schemas.microsoft.com/office/word/2010/wordprocessingCanvas" xmlns:cx="http://schemas.microsoft.com/office/drawing/2014/chartex" xmlns:cx1="http://schemas.microsoft.com/office/drawing/2015/9/8/chartex" xmlns:cx2="http://schemas.microsoft.com/office/drawing/2015/10/21/chartex" xmlns:cx3="http://schemas.microsoft.com/office/drawing/2016/5/9/chartex" xmlns:cx4="http://schemas.microsoft.com/office/drawing/2016/5/10/chartex" xmlns:cx5="http://schemas.microsoft.com/office/drawing/2016/5/11/chartex" xmlns:cx6="http://schemas.microsoft.com/office/drawing/2016/5/12/chartex" xmlns:cx7="http://schemas.microsoft.com/office/drawing/2016/5/13/chartex" xmlns:cx8="http://schemas.microsoft.com/office/drawing/2016/5/14/chartex" xmlns:mc="http://schemas.openxmlformats.org/markup-compatibility/2006" xmlns:aink="http://schemas.microsoft.com/office/drawing/2016/ink" xmlns:am3d="http://schemas.microsoft.com/office/drawing/2017/model3d" xmlns:o="urn:schemas-microsoft-com:office:office" xmlns:oel="http://schemas.microsoft.com/office/2019/extlst" xmlns:r="http://schemas.openxmlformats.org/officeDocument/2006/relationships" xmlns:m="http://schemas.openxmlformats.org/officeDocument/2006/math" xmlns:v="urn:schemas-microsoft-com:vml" xmlns:wp14="http://schemas.microsoft.com/office/word/2010/wordprocessingDrawing" xmlns:wp="http://schemas.openxmlformats.org/drawingml/2006/wordprocessingDrawing" xmlns:w10="urn:schemas-microsoft-com:office:word" xmlns:w="http://schemas.openxmlformats.org/wordprocessingml/2006/main" xmlns:w14="http://schemas.microsoft.com/office/word/2010/wordml" xmlns:w15="http://schemas.microsoft.com/office/word/2012/wordml" xmlns:w16cex="http://schemas.microsoft.com/office/word/2018/wordml/cex" xmlns:w16cid="http://schemas.microsoft.com/office/word/2016/wordml/cid" xmlns:w16="http://schemas.microsoft.com/office/word/2018/wordml" xmlns:w16du="http://schemas.microsoft.com/office/word/2023/wordml/word16du" xmlns:w16sdtdh="http://schemas.microsoft.com/office/word/2020/wordml/sdtdatahash" xmlns:w16sdtfl="http://schemas.microsoft.com/office/word/2024/wordml/sdtformatlock" xmlns:w16se="http://schemas.microsoft.com/office/word/2015/wordml/symex" xmlns:wpg="http://schemas.microsoft.com/office/word/2010/wordprocessingGroup" xmlns:wpi="http://schemas.microsoft.com/office/word/2010/wordprocessingInk" xmlns:wne="http://schemas.microsoft.com/office/word/2006/wordml" xmlns:wps="http://schemas.microsoft.com/office/word/2010/wordprocessingShape" mc:Ignorable="w14 w15 w16se w16cid w16 w16cex w16sdtdh w16sdtfl w16du wp14">
   <w:abstractNum w:abstractNumId="0" w15:restartNumberingAfterBreak="0">
+    <w:nsid w:val="1C33036A"/>
+    <w:multiLevelType w:val="hybridMultilevel"/>
+    <w:tmpl w:val="2B80364C"/>
+    <w:lvl w:ilvl="0" w:tplc="0409000F">
+      <w:start w:val="1"/>
+      <w:numFmt w:val="decimal"/>
+      <w:lvlText w:val="%1."/>
+      <w:lvlJc w:val="left"/>
+      <w:pPr>
+        <w:ind w:left="720" w:hanging="360"/>
+      </w:pPr>
+    </w:lvl>
+    <w:lvl w:ilvl="1" w:tplc="04090019" w:tentative="1">
+      <w:start w:val="1"/>
+      <w:numFmt w:val="lowerLetter"/>
+      <w:lvlText w:val="%2."/>
+      <w:lvlJc w:val="left"/>
+      <w:pPr>
+        <w:ind w:left="1440" w:hanging="360"/>
+      </w:pPr>
+    </w:lvl>
+    <w:lvl w:ilvl="2" w:tplc="0409001B" w:tentative="1">
+      <w:start w:val="1"/>
+      <w:numFmt w:val="lowerRoman"/>
+      <w:lvlText w:val="%3."/>
+      <w:lvlJc w:val="right"/>
+      <w:pPr>
+        <w:ind w:left="2160" w:hanging="180"/>
+      </w:pPr>
+    </w:lvl>
+    <w:lvl w:ilvl="3" w:tplc="0409000F" w:tentative="1">
+      <w:start w:val="1"/>
+      <w:numFmt w:val="decimal"/>
+      <w:lvlText w:val="%4."/>
+      <w:lvlJc w:val="left"/>
+      <w:pPr>
+        <w:ind w:left="2880" w:hanging="360"/>
+      </w:pPr>
+    </w:lvl>
+    <w:lvl w:ilvl="4" w:tplc="04090019" w:tentative="1">
+      <w:start w:val="1"/>
+      <w:numFmt w:val="lowerLetter"/>
+      <w:lvlText w:val="%5."/>
+      <w:lvlJc w:val="left"/>
+      <w:pPr>
+        <w:ind w:left="3600" w:hanging="360"/>
+      </w:pPr>
+    </w:lvl>
+    <w:lvl w:ilvl="5" w:tplc="0409001B" w:tentative="1">
+      <w:start w:val="1"/>
+      <w:numFmt w:val="lowerRoman"/>
+      <w:lvlText w:val="%6."/>
+      <w:lvlJc w:val="right"/>
+      <w:pPr>
+        <w:ind w:left="4320" w:hanging="180"/>
+      </w:pPr>
+    </w:lvl>
+    <w:lvl w:ilvl="6" w:tplc="0409000F" w:tentative="1">
+      <w:start w:val="1"/>
+      <w:numFmt w:val="decimal"/>
+      <w:lvlText w:val="%7."/>
+      <w:lvlJc w:val="left"/>
+      <w:pPr>
+        <w:ind w:left="5040" w:hanging="360"/>
+      </w:pPr>
+    </w:lvl>
+    <w:lvl w:ilvl="7" w:tplc="04090019" w:tentative="1">
+      <w:start w:val="1"/>
+      <w:numFmt w:val="lowerLetter"/>
+      <w:lvlText w:val="%8."/>
+      <w:lvlJc w:val="left"/>
+      <w:pPr>
+        <w:ind w:left="5760" w:hanging="360"/>
+      </w:pPr>
+    </w:lvl>
+    <w:lvl w:ilvl="8" w:tplc="0409001B" w:tentative="1">
+      <w:start w:val="1"/>
+      <w:numFmt w:val="lowerRoman"/>
+      <w:lvlText w:val="%9."/>
+      <w:lvlJc w:val="right"/>
+      <w:pPr>
+        <w:ind w:left="6480" w:hanging="180"/>
+      </w:pPr>
+    </w:lvl>
+  </w:abstractNum>
+  <w:abstractNum w:abstractNumId="1" w15:restartNumberingAfterBreak="0">
+    <w:nsid w:val="2766318D"/>
+    <w:multiLevelType w:val="hybridMultilevel"/>
+    <w:tmpl w:val="771E51B6"/>
+    <w:lvl w:ilvl="0" w:tplc="0409000F">
+      <w:start w:val="1"/>
+      <w:numFmt w:val="decimal"/>
+      <w:lvlText w:val="%1."/>
+      <w:lvlJc w:val="left"/>
+      <w:pPr>
+        <w:ind w:left="720" w:hanging="360"/>
+      </w:pPr>
+    </w:lvl>
+    <w:lvl w:ilvl="1" w:tplc="04090019" w:tentative="1">
+      <w:start w:val="1"/>
+      <w:numFmt w:val="lowerLetter"/>
+      <w:lvlText w:val="%2."/>
+      <w:lvlJc w:val="left"/>
+      <w:pPr>
+        <w:ind w:left="1440" w:hanging="360"/>
+      </w:pPr>
+    </w:lvl>
+    <w:lvl w:ilvl="2" w:tplc="0409001B" w:tentative="1">
+      <w:start w:val="1"/>
+      <w:numFmt w:val="lowerRoman"/>
+      <w:lvlText w:val="%3."/>
+      <w:lvlJc w:val="right"/>
+      <w:pPr>
+        <w:ind w:left="2160" w:hanging="180"/>
+      </w:pPr>
+    </w:lvl>
+    <w:lvl w:ilvl="3" w:tplc="0409000F" w:tentative="1">
+      <w:start w:val="1"/>
+      <w:numFmt w:val="decimal"/>
+      <w:lvlText w:val="%4."/>
+      <w:lvlJc w:val="left"/>
+      <w:pPr>
+        <w:ind w:left="2880" w:hanging="360"/>
+      </w:pPr>
+    </w:lvl>
+    <w:lvl w:ilvl="4" w:tplc="04090019" w:tentative="1">
+      <w:start w:val="1"/>
+      <w:numFmt w:val="lowerLetter"/>
+      <w:lvlText w:val="%5."/>
+      <w:lvlJc w:val="left"/>
+      <w:pPr>
+        <w:ind w:left="3600" w:hanging="360"/>
+      </w:pPr>
+    </w:lvl>
+    <w:lvl w:ilvl="5" w:tplc="0409001B" w:tentative="1">
+      <w:start w:val="1"/>
+      <w:numFmt w:val="lowerRoman"/>
+      <w:lvlText w:val="%6."/>
+      <w:lvlJc w:val="right"/>
+      <w:pPr>
+        <w:ind w:left="4320" w:hanging="180"/>
+      </w:pPr>
+    </w:lvl>
+    <w:lvl w:ilvl="6" w:tplc="0409000F" w:tentative="1">
+      <w:start w:val="1"/>
+      <w:numFmt w:val="decimal"/>
+      <w:lvlText w:val="%7."/>
+      <w:lvlJc w:val="left"/>
+      <w:pPr>
+        <w:ind w:left="5040" w:hanging="360"/>
+      </w:pPr>
+    </w:lvl>
+    <w:lvl w:ilvl="7" w:tplc="04090019" w:tentative="1">
+      <w:start w:val="1"/>
+      <w:numFmt w:val="lowerLetter"/>
+      <w:lvlText w:val="%8."/>
+      <w:lvlJc w:val="left"/>
+      <w:pPr>
+        <w:ind w:left="5760" w:hanging="360"/>
+      </w:pPr>
+    </w:lvl>
+    <w:lvl w:ilvl="8" w:tplc="0409001B" w:tentative="1">
+      <w:start w:val="1"/>
+      <w:numFmt w:val="lowerRoman"/>
+      <w:lvlText w:val="%9."/>
+      <w:lvlJc w:val="right"/>
+      <w:pPr>
+        <w:ind w:left="6480" w:hanging="180"/>
+      </w:pPr>
+    </w:lvl>
+  </w:abstractNum>
+  <w:abstractNum w:abstractNumId="2" w15:restartNumberingAfterBreak="0">
     <w:nsid w:val="2F615B7A"/>
     <w:multiLevelType w:val="hybridMultilevel"/>
     <w:tmpl w:val="66E013FC"/>
@@ -809,7 +1212,93 @@
       </w:pPr>
     </w:lvl>
   </w:abstractNum>
-  <w:abstractNum w:abstractNumId="1" w15:restartNumberingAfterBreak="0">
+  <w:abstractNum w:abstractNumId="3" w15:restartNumberingAfterBreak="0">
+    <w:nsid w:val="481E727C"/>
+    <w:multiLevelType w:val="hybridMultilevel"/>
+    <w:tmpl w:val="9DFE8838"/>
+    <w:lvl w:ilvl="0" w:tplc="0409000F">
+      <w:start w:val="1"/>
+      <w:numFmt w:val="decimal"/>
+      <w:lvlText w:val="%1."/>
+      <w:lvlJc w:val="left"/>
+      <w:pPr>
+        <w:ind w:left="720" w:hanging="360"/>
+      </w:pPr>
+    </w:lvl>
+    <w:lvl w:ilvl="1" w:tplc="04090019" w:tentative="1">
+      <w:start w:val="1"/>
+      <w:numFmt w:val="lowerLetter"/>
+      <w:lvlText w:val="%2."/>
+      <w:lvlJc w:val="left"/>
+      <w:pPr>
+        <w:ind w:left="1440" w:hanging="360"/>
+      </w:pPr>
+    </w:lvl>
+    <w:lvl w:ilvl="2" w:tplc="0409001B" w:tentative="1">
+      <w:start w:val="1"/>
+      <w:numFmt w:val="lowerRoman"/>
+      <w:lvlText w:val="%3."/>
+      <w:lvlJc w:val="right"/>
+      <w:pPr>
+        <w:ind w:left="2160" w:hanging="180"/>
+      </w:pPr>
+    </w:lvl>
+    <w:lvl w:ilvl="3" w:tplc="0409000F" w:tentative="1">
+      <w:start w:val="1"/>
+      <w:numFmt w:val="decimal"/>
+      <w:lvlText w:val="%4."/>
+      <w:lvlJc w:val="left"/>
+      <w:pPr>
+        <w:ind w:left="2880" w:hanging="360"/>
+      </w:pPr>
+    </w:lvl>
+    <w:lvl w:ilvl="4" w:tplc="04090019" w:tentative="1">
+      <w:start w:val="1"/>
+      <w:numFmt w:val="lowerLetter"/>
+      <w:lvlText w:val="%5."/>
+      <w:lvlJc w:val="left"/>
+      <w:pPr>
+        <w:ind w:left="3600" w:hanging="360"/>
+      </w:pPr>
+    </w:lvl>
+    <w:lvl w:ilvl="5" w:tplc="0409001B" w:tentative="1">
+      <w:start w:val="1"/>
+      <w:numFmt w:val="lowerRoman"/>
+      <w:lvlText w:val="%6."/>
+      <w:lvlJc w:val="right"/>
+      <w:pPr>
+        <w:ind w:left="4320" w:hanging="180"/>
+      </w:pPr>
+    </w:lvl>
+    <w:lvl w:ilvl="6" w:tplc="0409000F" w:tentative="1">
+      <w:start w:val="1"/>
+      <w:numFmt w:val="decimal"/>
+      <w:lvlText w:val="%7."/>
+      <w:lvlJc w:val="left"/>
+      <w:pPr>
+        <w:ind w:left="5040" w:hanging="360"/>
+      </w:pPr>
+    </w:lvl>
+    <w:lvl w:ilvl="7" w:tplc="04090019" w:tentative="1">
+      <w:start w:val="1"/>
+      <w:numFmt w:val="lowerLetter"/>
+      <w:lvlText w:val="%8."/>
+      <w:lvlJc w:val="left"/>
+      <w:pPr>
+        <w:ind w:left="5760" w:hanging="360"/>
+      </w:pPr>
+    </w:lvl>
+    <w:lvl w:ilvl="8" w:tplc="0409001B" w:tentative="1">
+      <w:start w:val="1"/>
+      <w:numFmt w:val="lowerRoman"/>
+      <w:lvlText w:val="%9."/>
+      <w:lvlJc w:val="right"/>
+      <w:pPr>
+        <w:ind w:left="6480" w:hanging="180"/>
+      </w:pPr>
+    </w:lvl>
+  </w:abstractNum>
+  <w:abstractNum w:abstractNumId="4" w15:restartNumberingAfterBreak="0">
     <w:nsid w:val="4AE56521"/>
     <w:multiLevelType w:val="multilevel"/>
     <w:tmpl w:val="E0F8456C"/>
@@ -958,7 +1447,7 @@
       </w:rPr>
     </w:lvl>
   </w:abstractNum>
-  <w:abstractNum w:abstractNumId="2" w15:restartNumberingAfterBreak="0">
+  <w:abstractNum w:abstractNumId="5" w15:restartNumberingAfterBreak="0">
     <w:nsid w:val="55817899"/>
     <w:multiLevelType w:val="hybridMultilevel"/>
     <w:tmpl w:val="AC20C66A"/>
@@ -1071,7 +1560,7 @@
       </w:rPr>
     </w:lvl>
   </w:abstractNum>
-  <w:abstractNum w:abstractNumId="3" w15:restartNumberingAfterBreak="0">
+  <w:abstractNum w:abstractNumId="6" w15:restartNumberingAfterBreak="0">
     <w:nsid w:val="605B4EC9"/>
     <w:multiLevelType w:val="hybridMultilevel"/>
     <w:tmpl w:val="890E4D2A"/>
@@ -1161,16 +1650,25 @@
     </w:lvl>
   </w:abstractNum>
   <w:num w:numId="1" w16cid:durableId="1067530020">
+    <w:abstractNumId w:val="2"/>
+  </w:num>
+  <w:num w:numId="2" w16cid:durableId="1467157605">
+    <w:abstractNumId w:val="4"/>
+  </w:num>
+  <w:num w:numId="3" w16cid:durableId="889346486">
+    <w:abstractNumId w:val="5"/>
+  </w:num>
+  <w:num w:numId="4" w16cid:durableId="433670817">
+    <w:abstractNumId w:val="6"/>
+  </w:num>
+  <w:num w:numId="5" w16cid:durableId="410394099">
     <w:abstractNumId w:val="0"/>
   </w:num>
-  <w:num w:numId="2" w16cid:durableId="1467157605">
+  <w:num w:numId="6" w16cid:durableId="689768679">
+    <w:abstractNumId w:val="3"/>
+  </w:num>
+  <w:num w:numId="7" w16cid:durableId="1500929164">
     <w:abstractNumId w:val="1"/>
-  </w:num>
-  <w:num w:numId="3" w16cid:durableId="889346486">
-    <w:abstractNumId w:val="2"/>
-  </w:num>
-  <w:num w:numId="4" w16cid:durableId="433670817">
-    <w:abstractNumId w:val="3"/>
   </w:num>
 </w:numbering>
 </file>
@@ -1778,6 +2276,7 @@
   <w:style w:type="character" w:default="1" w:styleId="DefaultParagraphFont">
     <w:name w:val="Default Paragraph Font"/>
     <w:uiPriority w:val="1"/>
+    <w:semiHidden/>
     <w:unhideWhenUsed/>
   </w:style>
   <w:style w:type="table" w:default="1" w:styleId="TableNormal">
@@ -2112,6 +2611,17 @@
     <w:rPr>
       <w:color w:val="605E5C"/>
       <w:shd w:val="clear" w:color="auto" w:fill="E1DFDD"/>
+    </w:rPr>
+  </w:style>
+  <w:style w:type="character" w:styleId="Strong">
+    <w:name w:val="Strong"/>
+    <w:basedOn w:val="DefaultParagraphFont"/>
+    <w:uiPriority w:val="22"/>
+    <w:qFormat/>
+    <w:rsid w:val="007172CB"/>
+    <w:rPr>
+      <w:b/>
+      <w:bCs/>
     </w:rPr>
   </w:style>
 </w:styles>

</xml_diff>

<commit_message>
strict schema :pydantic plus fast api
</commit_message>
<xml_diff>
--- a/0.1 Companies/ONe day.docx
+++ b/0.1 Companies/ONe day.docx
@@ -888,6 +888,250 @@
     <w:p>
       <w:pPr>
         <w:pStyle w:val="ListParagraph"/>
+        <w:numPr>
+          <w:ilvl w:val="0"/>
+          <w:numId w:val="1"/>
+        </w:numPr>
+        <w:rPr>
+          <w:sz w:val="36"/>
+          <w:szCs w:val="36"/>
+        </w:rPr>
+      </w:pPr>
+      <w:r>
+        <w:rPr>
+          <w:sz w:val="32"/>
+          <w:szCs w:val="32"/>
+        </w:rPr>
+        <w:t>Aleph Alpha's</w:t>
+      </w:r>
+    </w:p>
+    <w:p>
+      <w:pPr>
+        <w:pStyle w:val="ListParagraph"/>
+      </w:pPr>
+      <w:r>
+        <w:t xml:space="preserve">their biggest strategic project is </w:t>
+      </w:r>
+      <w:hyperlink r:id="rId9" w:tgtFrame="_blank" w:history="1">
+        <w:proofErr w:type="spellStart"/>
+        <w:r>
+          <w:rPr>
+            <w:rStyle w:val="Hyperlink"/>
+            <w:b/>
+            <w:bCs/>
+          </w:rPr>
+          <w:t>PhariaAI</w:t>
+        </w:r>
+        <w:proofErr w:type="spellEnd"/>
+      </w:hyperlink>
+      <w:r>
+        <w:t xml:space="preserve">, which is a </w:t>
+      </w:r>
+      <w:r>
+        <w:rPr>
+          <w:rStyle w:val="Strong"/>
+        </w:rPr>
+        <w:t>sovereign AI platform for enterprises and governments</w:t>
+      </w:r>
+      <w:r>
+        <w:t xml:space="preserve"> focused on explainability, auditability, and compliance </w:t>
+      </w:r>
+    </w:p>
+    <w:p>
+      <w:pPr>
+        <w:pStyle w:val="ListParagraph"/>
+        <w:rPr>
+          <w:rFonts w:ascii="Times New Roman" w:eastAsia="Times New Roman" w:hAnsi="Times New Roman" w:cs="Times New Roman"/>
+          <w:kern w:val="0"/>
+          <w:lang w:val="en-US"/>
+          <w14:ligatures w14:val="none"/>
+        </w:rPr>
+      </w:pPr>
+      <w:r>
+        <w:rPr>
+          <w:rFonts w:ascii="Times New Roman" w:eastAsia="Times New Roman" w:hAnsi="Times New Roman" w:cs="Times New Roman"/>
+          <w:kern w:val="0"/>
+          <w:lang w:val="en-US"/>
+          <w14:ligatures w14:val="none"/>
+        </w:rPr>
+        <w:t xml:space="preserve">Explainable AI (XAI) </w:t>
+      </w:r>
+    </w:p>
+    <w:p>
+      <w:pPr>
+        <w:pStyle w:val="ListParagraph"/>
+        <w:rPr>
+          <w:rFonts w:ascii="Times New Roman" w:eastAsia="Times New Roman" w:hAnsi="Times New Roman" w:cs="Times New Roman"/>
+          <w:kern w:val="0"/>
+          <w:lang w:val="en-US"/>
+          <w14:ligatures w14:val="none"/>
+        </w:rPr>
+      </w:pPr>
+      <w:r>
+        <w:rPr>
+          <w:rFonts w:ascii="Times New Roman" w:eastAsia="Times New Roman" w:hAnsi="Times New Roman" w:cs="Times New Roman"/>
+          <w:kern w:val="0"/>
+          <w:lang w:val="en-US"/>
+          <w14:ligatures w14:val="none"/>
+        </w:rPr>
+        <w:t xml:space="preserve">AI Governance </w:t>
+      </w:r>
+    </w:p>
+    <w:p>
+      <w:pPr>
+        <w:pStyle w:val="ListParagraph"/>
+        <w:rPr>
+          <w:rFonts w:ascii="Times New Roman" w:eastAsia="Times New Roman" w:hAnsi="Times New Roman" w:cs="Times New Roman"/>
+          <w:kern w:val="0"/>
+          <w:lang w:val="en-US"/>
+          <w14:ligatures w14:val="none"/>
+        </w:rPr>
+      </w:pPr>
+      <w:r>
+        <w:rPr>
+          <w:rFonts w:ascii="Times New Roman" w:eastAsia="Times New Roman" w:hAnsi="Times New Roman" w:cs="Times New Roman"/>
+          <w:kern w:val="0"/>
+          <w:lang w:val="en-US"/>
+          <w14:ligatures w14:val="none"/>
+        </w:rPr>
+        <w:t xml:space="preserve">Compliance-aware systems </w:t>
+      </w:r>
+    </w:p>
+    <w:p>
+      <w:pPr>
+        <w:pStyle w:val="ListParagraph"/>
+        <w:rPr>
+          <w:rFonts w:ascii="Times New Roman" w:eastAsia="Times New Roman" w:hAnsi="Times New Roman" w:cs="Times New Roman"/>
+          <w:kern w:val="0"/>
+          <w:lang w:val="en-US"/>
+          <w14:ligatures w14:val="none"/>
+        </w:rPr>
+      </w:pPr>
+      <w:r>
+        <w:rPr>
+          <w:rFonts w:ascii="Times New Roman" w:eastAsia="Times New Roman" w:hAnsi="Times New Roman" w:cs="Times New Roman"/>
+          <w:kern w:val="0"/>
+          <w:lang w:val="en-US"/>
+          <w14:ligatures w14:val="none"/>
+        </w:rPr>
+        <w:t xml:space="preserve">Production-grade AI </w:t>
+      </w:r>
+    </w:p>
+    <w:p>
+      <w:pPr>
+        <w:pStyle w:val="ListParagraph"/>
+        <w:rPr>
+          <w:rFonts w:ascii="Times New Roman" w:eastAsia="Times New Roman" w:hAnsi="Times New Roman" w:cs="Times New Roman"/>
+          <w:kern w:val="0"/>
+          <w:lang w:val="en-US"/>
+          <w14:ligatures w14:val="none"/>
+        </w:rPr>
+      </w:pPr>
+      <w:r>
+        <w:rPr>
+          <w:rFonts w:ascii="Times New Roman" w:eastAsia="Times New Roman" w:hAnsi="Times New Roman" w:cs="Times New Roman"/>
+          <w:kern w:val="0"/>
+          <w:lang w:val="en-US"/>
+          <w14:ligatures w14:val="none"/>
+        </w:rPr>
+        <w:t xml:space="preserve">Industrial AI deployment </w:t>
+      </w:r>
+    </w:p>
+    <w:p>
+      <w:pPr>
+        <w:pStyle w:val="ListParagraph"/>
+        <w:numPr>
+          <w:ilvl w:val="0"/>
+          <w:numId w:val="1"/>
+        </w:numPr>
+        <w:rPr>
+          <w:rFonts w:ascii="Times New Roman" w:eastAsia="Times New Roman" w:hAnsi="Times New Roman" w:cs="Times New Roman"/>
+          <w:kern w:val="0"/>
+          <w:sz w:val="32"/>
+          <w:szCs w:val="32"/>
+          <w:lang w:val="en-US"/>
+          <w14:ligatures w14:val="none"/>
+        </w:rPr>
+      </w:pPr>
+      <w:r>
+        <w:rPr>
+          <w:rFonts w:ascii="Times New Roman" w:eastAsia="Times New Roman" w:hAnsi="Times New Roman" w:cs="Times New Roman"/>
+          <w:kern w:val="0"/>
+          <w:sz w:val="32"/>
+          <w:szCs w:val="32"/>
+          <w:lang w:val="en-US"/>
+          <w14:ligatures w14:val="none"/>
+        </w:rPr>
+        <w:t>Black forest labs</w:t>
+      </w:r>
+      <w:r>
+        <w:rPr>
+          <w:rFonts w:ascii="Times New Roman" w:eastAsia="Times New Roman" w:hAnsi="Times New Roman" w:cs="Times New Roman"/>
+          <w:kern w:val="0"/>
+          <w:sz w:val="32"/>
+          <w:szCs w:val="32"/>
+          <w:lang w:val="en-US"/>
+          <w14:ligatures w14:val="none"/>
+        </w:rPr>
+        <w:t xml:space="preserve"> </w:t>
+      </w:r>
+      <w:r>
+        <w:t>Freiburg, Germany</w:t>
+      </w:r>
+    </w:p>
+    <w:p>
+      <w:pPr>
+        <w:pStyle w:val="ListParagraph"/>
+        <w:rPr>
+          <w:rFonts w:ascii="Times New Roman" w:eastAsia="Times New Roman" w:hAnsi="Times New Roman" w:cs="Times New Roman"/>
+          <w:kern w:val="0"/>
+          <w:lang w:val="en-US"/>
+          <w14:ligatures w14:val="none"/>
+        </w:rPr>
+      </w:pPr>
+      <w:r>
+        <w:rPr>
+          <w:rStyle w:val="Strong"/>
+        </w:rPr>
+        <w:t>FLUX</w:t>
+      </w:r>
+      <w:r>
+        <w:t>, their image generation model family</w:t>
+      </w:r>
+    </w:p>
+    <w:p>
+      <w:pPr>
+        <w:pStyle w:val="ListParagraph"/>
+        <w:rPr>
+          <w:lang w:val="en-US"/>
+        </w:rPr>
+      </w:pPr>
+      <w:r>
+        <w:t>high-quality and efficient visual AI generation</w:t>
+      </w:r>
+    </w:p>
+    <w:p>
+      <w:pPr>
+        <w:pStyle w:val="ListParagraph"/>
+        <w:rPr>
+          <w:sz w:val="36"/>
+          <w:szCs w:val="36"/>
+          <w:lang w:val="en-US"/>
+        </w:rPr>
+      </w:pPr>
+    </w:p>
+    <w:p>
+      <w:pPr>
+        <w:pStyle w:val="ListParagraph"/>
+        <w:rPr>
+          <w:sz w:val="36"/>
+          <w:szCs w:val="36"/>
+        </w:rPr>
+      </w:pPr>
+    </w:p>
+    <w:p>
+      <w:pPr>
+        <w:pStyle w:val="ListParagraph"/>
         <w:rPr>
           <w:sz w:val="28"/>
           <w:szCs w:val="28"/>
@@ -1448,6 +1692,155 @@
     </w:lvl>
   </w:abstractNum>
   <w:abstractNum w:abstractNumId="5" w15:restartNumberingAfterBreak="0">
+    <w:nsid w:val="4EA96DF1"/>
+    <w:multiLevelType w:val="multilevel"/>
+    <w:tmpl w:val="20CEDE4A"/>
+    <w:lvl w:ilvl="0">
+      <w:start w:val="1"/>
+      <w:numFmt w:val="bullet"/>
+      <w:lvlText w:val=""/>
+      <w:lvlJc w:val="left"/>
+      <w:pPr>
+        <w:tabs>
+          <w:tab w:val="num" w:pos="720"/>
+        </w:tabs>
+        <w:ind w:left="720" w:hanging="360"/>
+      </w:pPr>
+      <w:rPr>
+        <w:rFonts w:ascii="Symbol" w:hAnsi="Symbol" w:hint="default"/>
+        <w:sz w:val="20"/>
+      </w:rPr>
+    </w:lvl>
+    <w:lvl w:ilvl="1" w:tentative="1">
+      <w:start w:val="1"/>
+      <w:numFmt w:val="bullet"/>
+      <w:lvlText w:val="o"/>
+      <w:lvlJc w:val="left"/>
+      <w:pPr>
+        <w:tabs>
+          <w:tab w:val="num" w:pos="1440"/>
+        </w:tabs>
+        <w:ind w:left="1440" w:hanging="360"/>
+      </w:pPr>
+      <w:rPr>
+        <w:rFonts w:ascii="Courier New" w:hAnsi="Courier New" w:hint="default"/>
+        <w:sz w:val="20"/>
+      </w:rPr>
+    </w:lvl>
+    <w:lvl w:ilvl="2" w:tentative="1">
+      <w:start w:val="1"/>
+      <w:numFmt w:val="bullet"/>
+      <w:lvlText w:val=""/>
+      <w:lvlJc w:val="left"/>
+      <w:pPr>
+        <w:tabs>
+          <w:tab w:val="num" w:pos="2160"/>
+        </w:tabs>
+        <w:ind w:left="2160" w:hanging="360"/>
+      </w:pPr>
+      <w:rPr>
+        <w:rFonts w:ascii="Wingdings" w:hAnsi="Wingdings" w:hint="default"/>
+        <w:sz w:val="20"/>
+      </w:rPr>
+    </w:lvl>
+    <w:lvl w:ilvl="3" w:tentative="1">
+      <w:start w:val="1"/>
+      <w:numFmt w:val="bullet"/>
+      <w:lvlText w:val=""/>
+      <w:lvlJc w:val="left"/>
+      <w:pPr>
+        <w:tabs>
+          <w:tab w:val="num" w:pos="2880"/>
+        </w:tabs>
+        <w:ind w:left="2880" w:hanging="360"/>
+      </w:pPr>
+      <w:rPr>
+        <w:rFonts w:ascii="Wingdings" w:hAnsi="Wingdings" w:hint="default"/>
+        <w:sz w:val="20"/>
+      </w:rPr>
+    </w:lvl>
+    <w:lvl w:ilvl="4" w:tentative="1">
+      <w:start w:val="1"/>
+      <w:numFmt w:val="bullet"/>
+      <w:lvlText w:val=""/>
+      <w:lvlJc w:val="left"/>
+      <w:pPr>
+        <w:tabs>
+          <w:tab w:val="num" w:pos="3600"/>
+        </w:tabs>
+        <w:ind w:left="3600" w:hanging="360"/>
+      </w:pPr>
+      <w:rPr>
+        <w:rFonts w:ascii="Wingdings" w:hAnsi="Wingdings" w:hint="default"/>
+        <w:sz w:val="20"/>
+      </w:rPr>
+    </w:lvl>
+    <w:lvl w:ilvl="5" w:tentative="1">
+      <w:start w:val="1"/>
+      <w:numFmt w:val="bullet"/>
+      <w:lvlText w:val=""/>
+      <w:lvlJc w:val="left"/>
+      <w:pPr>
+        <w:tabs>
+          <w:tab w:val="num" w:pos="4320"/>
+        </w:tabs>
+        <w:ind w:left="4320" w:hanging="360"/>
+      </w:pPr>
+      <w:rPr>
+        <w:rFonts w:ascii="Wingdings" w:hAnsi="Wingdings" w:hint="default"/>
+        <w:sz w:val="20"/>
+      </w:rPr>
+    </w:lvl>
+    <w:lvl w:ilvl="6" w:tentative="1">
+      <w:start w:val="1"/>
+      <w:numFmt w:val="bullet"/>
+      <w:lvlText w:val=""/>
+      <w:lvlJc w:val="left"/>
+      <w:pPr>
+        <w:tabs>
+          <w:tab w:val="num" w:pos="5040"/>
+        </w:tabs>
+        <w:ind w:left="5040" w:hanging="360"/>
+      </w:pPr>
+      <w:rPr>
+        <w:rFonts w:ascii="Wingdings" w:hAnsi="Wingdings" w:hint="default"/>
+        <w:sz w:val="20"/>
+      </w:rPr>
+    </w:lvl>
+    <w:lvl w:ilvl="7" w:tentative="1">
+      <w:start w:val="1"/>
+      <w:numFmt w:val="bullet"/>
+      <w:lvlText w:val=""/>
+      <w:lvlJc w:val="left"/>
+      <w:pPr>
+        <w:tabs>
+          <w:tab w:val="num" w:pos="5760"/>
+        </w:tabs>
+        <w:ind w:left="5760" w:hanging="360"/>
+      </w:pPr>
+      <w:rPr>
+        <w:rFonts w:ascii="Wingdings" w:hAnsi="Wingdings" w:hint="default"/>
+        <w:sz w:val="20"/>
+      </w:rPr>
+    </w:lvl>
+    <w:lvl w:ilvl="8" w:tentative="1">
+      <w:start w:val="1"/>
+      <w:numFmt w:val="bullet"/>
+      <w:lvlText w:val=""/>
+      <w:lvlJc w:val="left"/>
+      <w:pPr>
+        <w:tabs>
+          <w:tab w:val="num" w:pos="6480"/>
+        </w:tabs>
+        <w:ind w:left="6480" w:hanging="360"/>
+      </w:pPr>
+      <w:rPr>
+        <w:rFonts w:ascii="Wingdings" w:hAnsi="Wingdings" w:hint="default"/>
+        <w:sz w:val="20"/>
+      </w:rPr>
+    </w:lvl>
+  </w:abstractNum>
+  <w:abstractNum w:abstractNumId="6" w15:restartNumberingAfterBreak="0">
     <w:nsid w:val="55817899"/>
     <w:multiLevelType w:val="hybridMultilevel"/>
     <w:tmpl w:val="AC20C66A"/>
@@ -1560,7 +1953,7 @@
       </w:rPr>
     </w:lvl>
   </w:abstractNum>
-  <w:abstractNum w:abstractNumId="6" w15:restartNumberingAfterBreak="0">
+  <w:abstractNum w:abstractNumId="7" w15:restartNumberingAfterBreak="0">
     <w:nsid w:val="605B4EC9"/>
     <w:multiLevelType w:val="hybridMultilevel"/>
     <w:tmpl w:val="890E4D2A"/>
@@ -1656,10 +2049,10 @@
     <w:abstractNumId w:val="4"/>
   </w:num>
   <w:num w:numId="3" w16cid:durableId="889346486">
-    <w:abstractNumId w:val="5"/>
+    <w:abstractNumId w:val="6"/>
   </w:num>
   <w:num w:numId="4" w16cid:durableId="433670817">
-    <w:abstractNumId w:val="6"/>
+    <w:abstractNumId w:val="7"/>
   </w:num>
   <w:num w:numId="5" w16cid:durableId="410394099">
     <w:abstractNumId w:val="0"/>
@@ -1669,6 +2062,9 @@
   </w:num>
   <w:num w:numId="7" w16cid:durableId="1500929164">
     <w:abstractNumId w:val="1"/>
+  </w:num>
+  <w:num w:numId="8" w16cid:durableId="843787528">
+    <w:abstractNumId w:val="5"/>
   </w:num>
 </w:numbering>
 </file>

</xml_diff>